<commit_message>
Dynamische pattern werden erkannt und geupdated
</commit_message>
<xml_diff>
--- a/Probleme.docx
+++ b/Probleme.docx
@@ -133,7 +133,7 @@
           <w:szCs w:val="22"/>
         </w:rPr>
         <w:pict w14:anchorId="4C27786A">
-          <v:rect id="_x0000_i1104" style="width:0;height:1.5pt" o:hralign="center" o:hrstd="t" o:hr="t" fillcolor="#a0a0a0" stroked="f"/>
+          <v:rect id="_x0000_i1025" style="width:0;height:1.5pt" o:hralign="center" o:hrstd="t" o:hr="t" fillcolor="#a0a0a0" stroked="f"/>
         </w:pict>
       </w:r>
     </w:p>
@@ -169,23 +169,7 @@
           <w:szCs w:val="22"/>
         </w:rPr>
         <w:br/>
-        <w:t xml:space="preserve">Der Preis wurde von </w:t>
-      </w:r>
-      <w:proofErr w:type="spellStart"/>
-      <w:r>
-        <w:rPr>
-          <w:sz w:val="22"/>
-          <w:szCs w:val="22"/>
-        </w:rPr>
-        <w:t>StayAI</w:t>
-      </w:r>
-      <w:proofErr w:type="spellEnd"/>
-      <w:r>
-        <w:rPr>
-          <w:sz w:val="22"/>
-          <w:szCs w:val="22"/>
-        </w:rPr>
-        <w:t xml:space="preserve"> als gesplittete Text Nodes gerendert, zum Beispiel "€" und "269.76". Die normale Text-Node-Formatierung konnte deshalb keinen vollständigen Währungswert erkennen.</w:t>
+        <w:t>Der Preis wurde von StayAI als gesplittete Text Nodes gerendert, zum Beispiel "€" und "269.76". Die normale Text-Node-Formatierung konnte deshalb keinen vollständigen Währungswert erkennen.</w:t>
       </w:r>
     </w:p>
     <w:p>
@@ -220,23 +204,7 @@
           <w:szCs w:val="22"/>
         </w:rPr>
         <w:br/>
-        <w:t xml:space="preserve">Eine Spezialbehandlung für gesplittete Currency Nodes wurde ergänzt. Sie erkennt den Parent-Node und formatiert den Betrag gezielt im </w:t>
-      </w:r>
-      <w:proofErr w:type="spellStart"/>
-      <w:r>
-        <w:rPr>
-          <w:sz w:val="22"/>
-          <w:szCs w:val="22"/>
-        </w:rPr>
-        <w:t>Amount</w:t>
-      </w:r>
-      <w:proofErr w:type="spellEnd"/>
-      <w:r>
-        <w:rPr>
-          <w:sz w:val="22"/>
-          <w:szCs w:val="22"/>
-        </w:rPr>
-        <w:t>-Node.</w:t>
+        <w:t>Eine Spezialbehandlung für gesplittete Currency Nodes wurde ergänzt. Sie erkennt den Parent-Node und formatiert den Betrag gezielt im Amount-Node.</w:t>
       </w:r>
     </w:p>
     <w:p>
@@ -252,7 +220,7 @@
           <w:szCs w:val="22"/>
         </w:rPr>
         <w:pict w14:anchorId="21435AF1">
-          <v:rect id="_x0000_i1105" style="width:0;height:1.5pt" o:hralign="center" o:hrstd="t" o:hr="t" fillcolor="#a0a0a0" stroked="f"/>
+          <v:rect id="_x0000_i1026" style="width:0;height:1.5pt" o:hralign="center" o:hrstd="t" o:hr="t" fillcolor="#a0a0a0" stroked="f"/>
         </w:pict>
       </w:r>
     </w:p>
@@ -288,39 +256,7 @@
           <w:szCs w:val="22"/>
         </w:rPr>
         <w:br/>
-        <w:t xml:space="preserve">Eine Zwischenlösung hat den formatierten Preis in einen einzelnen String umgebaut. Dadurch konnte </w:t>
-      </w:r>
-      <w:proofErr w:type="spellStart"/>
-      <w:r>
-        <w:rPr>
-          <w:sz w:val="22"/>
-          <w:szCs w:val="22"/>
-        </w:rPr>
-        <w:t>StayAI</w:t>
-      </w:r>
-      <w:proofErr w:type="spellEnd"/>
-      <w:r>
-        <w:rPr>
-          <w:sz w:val="22"/>
-          <w:szCs w:val="22"/>
-        </w:rPr>
-        <w:t xml:space="preserve">/React den ursprünglichen </w:t>
-      </w:r>
-      <w:proofErr w:type="spellStart"/>
-      <w:r>
-        <w:rPr>
-          <w:sz w:val="22"/>
-          <w:szCs w:val="22"/>
-        </w:rPr>
-        <w:t>Amount</w:t>
-      </w:r>
-      <w:proofErr w:type="spellEnd"/>
-      <w:r>
-        <w:rPr>
-          <w:sz w:val="22"/>
-          <w:szCs w:val="22"/>
-        </w:rPr>
-        <w:t>-Node bei späteren Änderungen nicht mehr zuverlässig aktualisieren.</w:t>
+        <w:t>Eine Zwischenlösung hat den formatierten Preis in einen einzelnen String umgebaut. Dadurch konnte StayAI/React den ursprünglichen Amount-Node bei späteren Änderungen nicht mehr zuverlässig aktualisieren.</w:t>
       </w:r>
     </w:p>
     <w:p>
@@ -355,23 +291,7 @@
           <w:szCs w:val="22"/>
         </w:rPr>
         <w:br/>
-        <w:t xml:space="preserve">Die ursprüngliche Text-Node-Struktur bleibt erhalten. Nur das separate Währungssymbol wird geleert, während der </w:t>
-      </w:r>
-      <w:proofErr w:type="spellStart"/>
-      <w:r>
-        <w:rPr>
-          <w:sz w:val="22"/>
-          <w:szCs w:val="22"/>
-        </w:rPr>
-        <w:t>Amount</w:t>
-      </w:r>
-      <w:proofErr w:type="spellEnd"/>
-      <w:r>
-        <w:rPr>
-          <w:sz w:val="22"/>
-          <w:szCs w:val="22"/>
-        </w:rPr>
-        <w:t>-Node formatiert wird.</w:t>
+        <w:t>Die ursprüngliche Text-Node-Struktur bleibt erhalten. Nur das separate Währungssymbol wird geleert, während der Amount-Node formatiert wird.</w:t>
       </w:r>
     </w:p>
     <w:p>
@@ -387,7 +307,7 @@
           <w:szCs w:val="22"/>
         </w:rPr>
         <w:pict w14:anchorId="3004A0A0">
-          <v:rect id="_x0000_i1106" style="width:0;height:1.5pt" o:hralign="center" o:hrstd="t" o:hr="t" fillcolor="#a0a0a0" stroked="f"/>
+          <v:rect id="_x0000_i1027" style="width:0;height:1.5pt" o:hralign="center" o:hrstd="t" o:hr="t" fillcolor="#a0a0a0" stroked="f"/>
         </w:pict>
       </w:r>
     </w:p>
@@ -458,103 +378,7 @@
           <w:szCs w:val="22"/>
         </w:rPr>
         <w:br/>
-        <w:t xml:space="preserve">Der Parent wird mit </w:t>
-      </w:r>
-      <w:proofErr w:type="spellStart"/>
-      <w:r>
-        <w:rPr>
-          <w:sz w:val="22"/>
-          <w:szCs w:val="22"/>
-        </w:rPr>
-        <w:t>data</w:t>
-      </w:r>
-      <w:proofErr w:type="spellEnd"/>
-      <w:r>
-        <w:rPr>
-          <w:sz w:val="22"/>
-          <w:szCs w:val="22"/>
-        </w:rPr>
-        <w:t>-</w:t>
-      </w:r>
-      <w:proofErr w:type="spellStart"/>
-      <w:r>
-        <w:rPr>
-          <w:sz w:val="22"/>
-          <w:szCs w:val="22"/>
-        </w:rPr>
-        <w:t>stayai</w:t>
-      </w:r>
-      <w:proofErr w:type="spellEnd"/>
-      <w:r>
-        <w:rPr>
-          <w:sz w:val="22"/>
-          <w:szCs w:val="22"/>
-        </w:rPr>
-        <w:t>-split-</w:t>
-      </w:r>
-      <w:proofErr w:type="spellStart"/>
-      <w:r>
-        <w:rPr>
-          <w:sz w:val="22"/>
-          <w:szCs w:val="22"/>
-        </w:rPr>
-        <w:t>currency</w:t>
-      </w:r>
-      <w:proofErr w:type="spellEnd"/>
-      <w:r>
-        <w:rPr>
-          <w:sz w:val="22"/>
-          <w:szCs w:val="22"/>
-        </w:rPr>
-        <w:t>="</w:t>
-      </w:r>
-      <w:proofErr w:type="spellStart"/>
-      <w:r>
-        <w:rPr>
-          <w:sz w:val="22"/>
-          <w:szCs w:val="22"/>
-        </w:rPr>
-        <w:t>true</w:t>
-      </w:r>
-      <w:proofErr w:type="spellEnd"/>
-      <w:r>
-        <w:rPr>
-          <w:sz w:val="22"/>
-          <w:szCs w:val="22"/>
-        </w:rPr>
-        <w:t xml:space="preserve">" markiert. Bei späteren </w:t>
-      </w:r>
-      <w:proofErr w:type="spellStart"/>
-      <w:r>
-        <w:rPr>
-          <w:sz w:val="22"/>
-          <w:szCs w:val="22"/>
-        </w:rPr>
-        <w:t>characterData</w:t>
-      </w:r>
-      <w:proofErr w:type="spellEnd"/>
-      <w:r>
-        <w:rPr>
-          <w:sz w:val="22"/>
-          <w:szCs w:val="22"/>
-        </w:rPr>
-        <w:t xml:space="preserve">-Updates wird gezielt der aktualisierte </w:t>
-      </w:r>
-      <w:proofErr w:type="spellStart"/>
-      <w:r>
-        <w:rPr>
-          <w:sz w:val="22"/>
-          <w:szCs w:val="22"/>
-        </w:rPr>
-        <w:t>Amount</w:t>
-      </w:r>
-      <w:proofErr w:type="spellEnd"/>
-      <w:r>
-        <w:rPr>
-          <w:sz w:val="22"/>
-          <w:szCs w:val="22"/>
-        </w:rPr>
-        <w:t>-Node erneut formatiert.</w:t>
+        <w:t>Der Parent wird mit data-stayai-split-currency="true" markiert. Bei späteren characterData-Updates wird gezielt der aktualisierte Amount-Node erneut formatiert.</w:t>
       </w:r>
     </w:p>
     <w:p>
@@ -570,7 +394,7 @@
           <w:szCs w:val="22"/>
         </w:rPr>
         <w:pict w14:anchorId="3C92E222">
-          <v:rect id="_x0000_i1107" style="width:0;height:1.5pt" o:hralign="center" o:hrstd="t" o:hr="t" fillcolor="#a0a0a0" stroked="f"/>
+          <v:rect id="_x0000_i1028" style="width:0;height:1.5pt" o:hralign="center" o:hrstd="t" o:hr="t" fillcolor="#a0a0a0" stroked="f"/>
         </w:pict>
       </w:r>
     </w:p>
@@ -687,7 +511,7 @@
           <w:szCs w:val="22"/>
         </w:rPr>
         <w:pict w14:anchorId="69F9FB2E">
-          <v:rect id="_x0000_i1108" style="width:0;height:1.5pt" o:hralign="center" o:hrstd="t" o:hr="t" fillcolor="#a0a0a0" stroked="f"/>
+          <v:rect id="_x0000_i1029" style="width:0;height:1.5pt" o:hralign="center" o:hrstd="t" o:hr="t" fillcolor="#a0a0a0" stroked="f"/>
         </w:pict>
       </w:r>
     </w:p>
@@ -758,55 +582,7 @@
           <w:szCs w:val="22"/>
         </w:rPr>
         <w:br/>
-        <w:t>Body-</w:t>
-      </w:r>
-      <w:proofErr w:type="spellStart"/>
-      <w:r>
-        <w:rPr>
-          <w:sz w:val="22"/>
-          <w:szCs w:val="22"/>
-        </w:rPr>
-        <w:t>Hiding</w:t>
-      </w:r>
-      <w:proofErr w:type="spellEnd"/>
-      <w:r>
-        <w:rPr>
-          <w:sz w:val="22"/>
-          <w:szCs w:val="22"/>
-        </w:rPr>
-        <w:t xml:space="preserve"> wird nur noch </w:t>
-      </w:r>
-      <w:proofErr w:type="gramStart"/>
-      <w:r>
-        <w:rPr>
-          <w:sz w:val="22"/>
-          <w:szCs w:val="22"/>
-        </w:rPr>
-        <w:t>beim initialen Load</w:t>
-      </w:r>
-      <w:proofErr w:type="gramEnd"/>
-      <w:r>
-        <w:rPr>
-          <w:sz w:val="22"/>
-          <w:szCs w:val="22"/>
-        </w:rPr>
-        <w:t xml:space="preserve"> verwendet, nicht mehr bei internen </w:t>
-      </w:r>
-      <w:proofErr w:type="spellStart"/>
-      <w:r>
-        <w:rPr>
-          <w:sz w:val="22"/>
-          <w:szCs w:val="22"/>
-        </w:rPr>
-        <w:t>Navigationen</w:t>
-      </w:r>
-      <w:proofErr w:type="spellEnd"/>
-      <w:r>
-        <w:rPr>
-          <w:sz w:val="22"/>
-          <w:szCs w:val="22"/>
-        </w:rPr>
-        <w:t>.</w:t>
+        <w:t>Body-Hiding wird nur noch beim initialen Load verwendet, nicht mehr bei internen Navigationen.</w:t>
       </w:r>
     </w:p>
     <w:p>
@@ -822,7 +598,7 @@
           <w:szCs w:val="22"/>
         </w:rPr>
         <w:pict w14:anchorId="362602D5">
-          <v:rect id="_x0000_i1109" style="width:0;height:1.5pt" o:hralign="center" o:hrstd="t" o:hr="t" fillcolor="#a0a0a0" stroked="f"/>
+          <v:rect id="_x0000_i1030" style="width:0;height:1.5pt" o:hralign="center" o:hrstd="t" o:hr="t" fillcolor="#a0a0a0" stroked="f"/>
         </w:pict>
       </w:r>
     </w:p>
@@ -893,23 +669,7 @@
           <w:szCs w:val="22"/>
         </w:rPr>
         <w:br/>
-        <w:t xml:space="preserve">Die Seite bleibt bei internen </w:t>
-      </w:r>
-      <w:proofErr w:type="spellStart"/>
-      <w:r>
-        <w:rPr>
-          <w:sz w:val="22"/>
-          <w:szCs w:val="22"/>
-        </w:rPr>
-        <w:t>Navigationen</w:t>
-      </w:r>
-      <w:proofErr w:type="spellEnd"/>
-      <w:r>
-        <w:rPr>
-          <w:sz w:val="22"/>
-          <w:szCs w:val="22"/>
-        </w:rPr>
-        <w:t xml:space="preserve"> sichtbar. Die Übersetzung läuft direkt nach dem DOM-Update.</w:t>
+        <w:t>Die Seite bleibt bei internen Navigationen sichtbar. Die Übersetzung läuft direkt nach dem DOM-Update.</w:t>
       </w:r>
     </w:p>
     <w:p>
@@ -925,7 +685,7 @@
           <w:szCs w:val="22"/>
         </w:rPr>
         <w:pict w14:anchorId="6B47672A">
-          <v:rect id="_x0000_i1110" style="width:0;height:1.5pt" o:hralign="center" o:hrstd="t" o:hr="t" fillcolor="#a0a0a0" stroked="f"/>
+          <v:rect id="_x0000_i1031" style="width:0;height:1.5pt" o:hralign="center" o:hrstd="t" o:hr="t" fillcolor="#a0a0a0" stroked="f"/>
         </w:pict>
       </w:r>
     </w:p>
@@ -961,17 +721,8 @@
           <w:szCs w:val="22"/>
         </w:rPr>
         <w:br/>
-        <w:t xml:space="preserve">Die erste Übersetzung beim Route-Wechsel lief erst verzögert nach 250 </w:t>
-      </w:r>
-      <w:proofErr w:type="spellStart"/>
-      <w:r>
-        <w:rPr>
-          <w:sz w:val="22"/>
-          <w:szCs w:val="22"/>
-        </w:rPr>
-        <w:t>ms.</w:t>
-      </w:r>
-      <w:proofErr w:type="spellEnd"/>
+        <w:t>Die erste Übersetzung beim Route-Wechsel lief erst verzögert nach 250 ms.</w:t>
+      </w:r>
     </w:p>
     <w:p>
       <w:pPr>
@@ -1005,23 +756,7 @@
           <w:szCs w:val="22"/>
         </w:rPr>
         <w:br/>
-        <w:t xml:space="preserve">Statt einer festen Verzögerung wird </w:t>
-      </w:r>
-      <w:proofErr w:type="spellStart"/>
-      <w:r>
-        <w:rPr>
-          <w:sz w:val="22"/>
-          <w:szCs w:val="22"/>
-        </w:rPr>
-        <w:t>requestAnimationFrame</w:t>
-      </w:r>
-      <w:proofErr w:type="spellEnd"/>
-      <w:r>
-        <w:rPr>
-          <w:sz w:val="22"/>
-          <w:szCs w:val="22"/>
-        </w:rPr>
-        <w:t xml:space="preserve"> genutzt, damit die Übersetzung direkt im nächsten Render-Zyklus ausgeführt wird.</w:t>
+        <w:t>Statt einer festen Verzögerung wird requestAnimationFrame genutzt, damit die Übersetzung direkt im nächsten Render-Zyklus ausgeführt wird.</w:t>
       </w:r>
     </w:p>
     <w:p>
@@ -1037,7 +772,7 @@
           <w:szCs w:val="22"/>
         </w:rPr>
         <w:pict w14:anchorId="2D4DA288">
-          <v:rect id="_x0000_i1111" style="width:0;height:1.5pt" o:hralign="center" o:hrstd="t" o:hr="t" fillcolor="#a0a0a0" stroked="f"/>
+          <v:rect id="_x0000_i1032" style="width:0;height:1.5pt" o:hralign="center" o:hrstd="t" o:hr="t" fillcolor="#a0a0a0" stroked="f"/>
         </w:pict>
       </w:r>
     </w:p>
@@ -1073,22 +808,7 @@
           <w:szCs w:val="22"/>
         </w:rPr>
         <w:br/>
-      </w:r>
-      <w:proofErr w:type="spellStart"/>
-      <w:r>
-        <w:rPr>
-          <w:sz w:val="22"/>
-          <w:szCs w:val="22"/>
-        </w:rPr>
-        <w:t>Lazy-loaded</w:t>
-      </w:r>
-      <w:proofErr w:type="spellEnd"/>
-      <w:r>
-        <w:rPr>
-          <w:sz w:val="22"/>
-          <w:szCs w:val="22"/>
-        </w:rPr>
-        <w:t xml:space="preserve"> Inhalte kamen nach dem Seitenwechsel teilweise später in den DOM.</w:t>
+        <w:t>Lazy-loaded Inhalte kamen nach dem Seitenwechsel teilweise später in den DOM.</w:t>
       </w:r>
     </w:p>
     <w:p>
@@ -1123,71 +843,7 @@
           <w:szCs w:val="22"/>
         </w:rPr>
         <w:br/>
-        <w:t>Zusätzliche Follow-</w:t>
-      </w:r>
-      <w:proofErr w:type="spellStart"/>
-      <w:r>
-        <w:rPr>
-          <w:sz w:val="22"/>
-          <w:szCs w:val="22"/>
-        </w:rPr>
-        <w:t>up</w:t>
-      </w:r>
-      <w:proofErr w:type="spellEnd"/>
-      <w:r>
-        <w:rPr>
-          <w:sz w:val="22"/>
-          <w:szCs w:val="22"/>
-        </w:rPr>
-        <w:t xml:space="preserve">-Runs nach 100 </w:t>
-      </w:r>
-      <w:proofErr w:type="spellStart"/>
-      <w:r>
-        <w:rPr>
-          <w:sz w:val="22"/>
-          <w:szCs w:val="22"/>
-        </w:rPr>
-        <w:t>ms</w:t>
-      </w:r>
-      <w:proofErr w:type="spellEnd"/>
-      <w:r>
-        <w:rPr>
-          <w:sz w:val="22"/>
-          <w:szCs w:val="22"/>
-        </w:rPr>
-        <w:t xml:space="preserve">, 400 </w:t>
-      </w:r>
-      <w:proofErr w:type="spellStart"/>
-      <w:r>
-        <w:rPr>
-          <w:sz w:val="22"/>
-          <w:szCs w:val="22"/>
-        </w:rPr>
-        <w:t>ms</w:t>
-      </w:r>
-      <w:proofErr w:type="spellEnd"/>
-      <w:r>
-        <w:rPr>
-          <w:sz w:val="22"/>
-          <w:szCs w:val="22"/>
-        </w:rPr>
-        <w:t xml:space="preserve"> und 1000 </w:t>
-      </w:r>
-      <w:proofErr w:type="spellStart"/>
-      <w:r>
-        <w:rPr>
-          <w:sz w:val="22"/>
-          <w:szCs w:val="22"/>
-        </w:rPr>
-        <w:t>ms</w:t>
-      </w:r>
-      <w:proofErr w:type="spellEnd"/>
-      <w:r>
-        <w:rPr>
-          <w:sz w:val="22"/>
-          <w:szCs w:val="22"/>
-        </w:rPr>
-        <w:t xml:space="preserve"> stellen sicher, dass auch später gerenderte Inhalte übersetzt werden.</w:t>
+        <w:t>Zusätzliche Follow-up-Runs nach 100 ms, 400 ms und 1000 ms stellen sicher, dass auch später gerenderte Inhalte übersetzt werden.</w:t>
       </w:r>
     </w:p>
     <w:p>
@@ -1203,7 +859,7 @@
           <w:szCs w:val="22"/>
         </w:rPr>
         <w:pict w14:anchorId="16610104">
-          <v:rect id="_x0000_i1112" style="width:0;height:1.5pt" o:hralign="center" o:hrstd="t" o:hr="t" fillcolor="#a0a0a0" stroked="f"/>
+          <v:rect id="_x0000_i1033" style="width:0;height:1.5pt" o:hralign="center" o:hrstd="t" o:hr="t" fillcolor="#a0a0a0" stroked="f"/>
         </w:pict>
       </w:r>
     </w:p>
@@ -1233,27 +889,7 @@
           <w:sz w:val="22"/>
           <w:szCs w:val="22"/>
         </w:rPr>
-        <w:t xml:space="preserve"> DOM-</w:t>
-      </w:r>
-      <w:proofErr w:type="spellStart"/>
-      <w:r>
-        <w:rPr>
-          <w:b/>
-          <w:bCs/>
-          <w:sz w:val="22"/>
-          <w:szCs w:val="22"/>
-        </w:rPr>
-        <w:t>Mutations</w:t>
-      </w:r>
-      <w:proofErr w:type="spellEnd"/>
-      <w:r>
-        <w:rPr>
-          <w:b/>
-          <w:bCs/>
-          <w:sz w:val="22"/>
-          <w:szCs w:val="22"/>
-        </w:rPr>
-        <w:t xml:space="preserve"> und UI-Wechsel</w:t>
+        <w:t xml:space="preserve"> DOM-Mutations und UI-Wechsel</w:t>
       </w:r>
     </w:p>
     <w:p>
@@ -1323,39 +959,7 @@
           <w:szCs w:val="22"/>
         </w:rPr>
         <w:br/>
-        <w:t xml:space="preserve">Neue DOM-Nodes werden im </w:t>
-      </w:r>
-      <w:proofErr w:type="spellStart"/>
-      <w:r>
-        <w:rPr>
-          <w:sz w:val="22"/>
-          <w:szCs w:val="22"/>
-        </w:rPr>
-        <w:t>MutationObserver</w:t>
-      </w:r>
-      <w:proofErr w:type="spellEnd"/>
-      <w:r>
-        <w:rPr>
-          <w:sz w:val="22"/>
-          <w:szCs w:val="22"/>
-        </w:rPr>
-        <w:t xml:space="preserve"> sofort übersetzt, statt nur einen verzögerten </w:t>
-      </w:r>
-      <w:proofErr w:type="spellStart"/>
-      <w:r>
-        <w:rPr>
-          <w:sz w:val="22"/>
-          <w:szCs w:val="22"/>
-        </w:rPr>
-        <w:t>Debounce</w:t>
-      </w:r>
-      <w:proofErr w:type="spellEnd"/>
-      <w:r>
-        <w:rPr>
-          <w:sz w:val="22"/>
-          <w:szCs w:val="22"/>
-        </w:rPr>
-        <w:t>-Run zu planen.</w:t>
+        <w:t>Neue DOM-Nodes werden im MutationObserver sofort übersetzt, statt nur einen verzögerten Debounce-Run zu planen.</w:t>
       </w:r>
     </w:p>
     <w:p>
@@ -1371,7 +975,7 @@
           <w:szCs w:val="22"/>
         </w:rPr>
         <w:pict w14:anchorId="2270C67B">
-          <v:rect id="_x0000_i1113" style="width:0;height:1.5pt" o:hralign="center" o:hrstd="t" o:hr="t" fillcolor="#a0a0a0" stroked="f"/>
+          <v:rect id="_x0000_i1034" style="width:0;height:1.5pt" o:hralign="center" o:hrstd="t" o:hr="t" fillcolor="#a0a0a0" stroked="f"/>
         </w:pict>
       </w:r>
     </w:p>
@@ -1443,38 +1047,7 @@
           <w:szCs w:val="22"/>
         </w:rPr>
         <w:br/>
-      </w:r>
-      <w:proofErr w:type="spellStart"/>
-      <w:r>
-        <w:rPr>
-          <w:sz w:val="22"/>
-          <w:szCs w:val="22"/>
-        </w:rPr>
-        <w:t>characterData</w:t>
-      </w:r>
-      <w:proofErr w:type="spellEnd"/>
-      <w:r>
-        <w:rPr>
-          <w:sz w:val="22"/>
-          <w:szCs w:val="22"/>
-        </w:rPr>
-        <w:t xml:space="preserve">: </w:t>
-      </w:r>
-      <w:proofErr w:type="spellStart"/>
-      <w:r>
-        <w:rPr>
-          <w:sz w:val="22"/>
-          <w:szCs w:val="22"/>
-        </w:rPr>
-        <w:t>true</w:t>
-      </w:r>
-      <w:proofErr w:type="spellEnd"/>
-      <w:r>
-        <w:rPr>
-          <w:sz w:val="22"/>
-          <w:szCs w:val="22"/>
-        </w:rPr>
-        <w:t xml:space="preserve"> wurde aktiviert. Dadurch werden geänderte Text-Nodes direkt erkannt und verarbeitet.</w:t>
+        <w:t>characterData: true wurde aktiviert. Dadurch werden geänderte Text-Nodes direkt erkannt und verarbeitet.</w:t>
       </w:r>
     </w:p>
     <w:p>
@@ -1490,7 +1063,7 @@
           <w:szCs w:val="22"/>
         </w:rPr>
         <w:pict w14:anchorId="5B7B0FDC">
-          <v:rect id="_x0000_i1114" style="width:0;height:1.5pt" o:hralign="center" o:hrstd="t" o:hr="t" fillcolor="#a0a0a0" stroked="f"/>
+          <v:rect id="_x0000_i1035" style="width:0;height:1.5pt" o:hralign="center" o:hrstd="t" o:hr="t" fillcolor="#a0a0a0" stroked="f"/>
         </w:pict>
       </w:r>
     </w:p>
@@ -1526,39 +1099,7 @@
           <w:szCs w:val="22"/>
         </w:rPr>
         <w:br/>
-        <w:t xml:space="preserve">Attribute wie </w:t>
-      </w:r>
-      <w:proofErr w:type="spellStart"/>
-      <w:r>
-        <w:rPr>
-          <w:sz w:val="22"/>
-          <w:szCs w:val="22"/>
-        </w:rPr>
-        <w:t>placeholder</w:t>
-      </w:r>
-      <w:proofErr w:type="spellEnd"/>
-      <w:r>
-        <w:rPr>
-          <w:sz w:val="22"/>
-          <w:szCs w:val="22"/>
-        </w:rPr>
-        <w:t xml:space="preserve">, title, </w:t>
-      </w:r>
-      <w:proofErr w:type="spellStart"/>
-      <w:r>
-        <w:rPr>
-          <w:sz w:val="22"/>
-          <w:szCs w:val="22"/>
-        </w:rPr>
-        <w:t>aria</w:t>
-      </w:r>
-      <w:proofErr w:type="spellEnd"/>
-      <w:r>
-        <w:rPr>
-          <w:sz w:val="22"/>
-          <w:szCs w:val="22"/>
-        </w:rPr>
-        <w:t>-label und alt konnten kurz unübersetzt bleiben.</w:t>
+        <w:t>Attribute wie placeholder, title, aria-label und alt konnten kurz unübersetzt bleiben.</w:t>
       </w:r>
     </w:p>
     <w:p>
@@ -1593,64 +1134,23 @@
           <w:szCs w:val="22"/>
         </w:rPr>
         <w:br/>
-        <w:t xml:space="preserve">Attribute werden bei </w:t>
-      </w:r>
-      <w:proofErr w:type="spellStart"/>
-      <w:r>
-        <w:rPr>
-          <w:sz w:val="22"/>
-          <w:szCs w:val="22"/>
-        </w:rPr>
-        <w:t>Mutations</w:t>
-      </w:r>
-      <w:proofErr w:type="spellEnd"/>
-      <w:r>
-        <w:rPr>
-          <w:sz w:val="22"/>
-          <w:szCs w:val="22"/>
-        </w:rPr>
-        <w:t xml:space="preserve"> direkt über </w:t>
-      </w:r>
-      <w:proofErr w:type="spellStart"/>
-      <w:proofErr w:type="gramStart"/>
-      <w:r>
-        <w:rPr>
-          <w:sz w:val="22"/>
-          <w:szCs w:val="22"/>
-        </w:rPr>
-        <w:t>processAttributes</w:t>
-      </w:r>
-      <w:proofErr w:type="spellEnd"/>
-      <w:r>
-        <w:rPr>
-          <w:sz w:val="22"/>
-          <w:szCs w:val="22"/>
-        </w:rPr>
-        <w:t>(</w:t>
-      </w:r>
-      <w:proofErr w:type="gramEnd"/>
-      <w:r>
-        <w:rPr>
-          <w:sz w:val="22"/>
-          <w:szCs w:val="22"/>
-        </w:rPr>
-        <w:t>) verarbeitet.</w:t>
-      </w:r>
-    </w:p>
-    <w:p>
-      <w:pPr>
-        <w:rPr>
-          <w:sz w:val="22"/>
-          <w:szCs w:val="22"/>
-        </w:rPr>
-      </w:pPr>
-      <w:r>
-        <w:rPr>
-          <w:sz w:val="22"/>
-          <w:szCs w:val="22"/>
-        </w:rPr>
-        <w:pict w14:anchorId="1B1C4716">
-          <v:rect id="_x0000_i1115" style="width:0;height:1.5pt" o:hralign="center" o:hrstd="t" o:hr="t" fillcolor="#a0a0a0" stroked="f"/>
+        <w:t>Attribute werden bei Mutations direkt über processAttributes() verarbeitet.</w:t>
+      </w:r>
+    </w:p>
+    <w:p>
+      <w:pPr>
+        <w:rPr>
+          <w:sz w:val="22"/>
+          <w:szCs w:val="22"/>
+        </w:rPr>
+      </w:pPr>
+      <w:r>
+        <w:rPr>
+          <w:sz w:val="22"/>
+          <w:szCs w:val="22"/>
+        </w:rPr>
+        <w:pict w14:anchorId="65A2D075">
+          <v:rect id="_x0000_i1038" style="width:0;height:1.5pt" o:hralign="center" o:hrstd="t" o:hr="t" fillcolor="#a0a0a0" stroked="f"/>
         </w:pict>
       </w:r>
     </w:p>
@@ -1686,39 +1186,7 @@
           <w:szCs w:val="22"/>
         </w:rPr>
         <w:br/>
-        <w:t xml:space="preserve">Der </w:t>
-      </w:r>
-      <w:proofErr w:type="spellStart"/>
-      <w:r>
-        <w:rPr>
-          <w:sz w:val="22"/>
-          <w:szCs w:val="22"/>
-        </w:rPr>
-        <w:t>Debounce</w:t>
-      </w:r>
-      <w:proofErr w:type="spellEnd"/>
-      <w:r>
-        <w:rPr>
-          <w:sz w:val="22"/>
-          <w:szCs w:val="22"/>
-        </w:rPr>
-        <w:t xml:space="preserve"> von 200 </w:t>
-      </w:r>
-      <w:proofErr w:type="spellStart"/>
-      <w:r>
-        <w:rPr>
-          <w:sz w:val="22"/>
-          <w:szCs w:val="22"/>
-        </w:rPr>
-        <w:t>ms</w:t>
-      </w:r>
-      <w:proofErr w:type="spellEnd"/>
-      <w:r>
-        <w:rPr>
-          <w:sz w:val="22"/>
-          <w:szCs w:val="22"/>
-        </w:rPr>
-        <w:t xml:space="preserve"> war für sichtbare UI-Wechsel zu langsam.</w:t>
+        <w:t>Der Debounce von 200 ms war für sichtbare UI-Wechsel zu langsam.</w:t>
       </w:r>
     </w:p>
     <w:p>
@@ -1753,64 +1221,228 @@
           <w:szCs w:val="22"/>
         </w:rPr>
         <w:br/>
-        <w:t xml:space="preserve">Der </w:t>
-      </w:r>
-      <w:proofErr w:type="spellStart"/>
-      <w:r>
-        <w:rPr>
-          <w:sz w:val="22"/>
-          <w:szCs w:val="22"/>
-        </w:rPr>
-        <w:t>Debounce</w:t>
-      </w:r>
-      <w:proofErr w:type="spellEnd"/>
-      <w:r>
-        <w:rPr>
-          <w:sz w:val="22"/>
-          <w:szCs w:val="22"/>
-        </w:rPr>
-        <w:t xml:space="preserve"> wurde auf 50 </w:t>
-      </w:r>
-      <w:proofErr w:type="spellStart"/>
-      <w:r>
-        <w:rPr>
-          <w:sz w:val="22"/>
-          <w:szCs w:val="22"/>
-        </w:rPr>
-        <w:t>ms</w:t>
-      </w:r>
-      <w:proofErr w:type="spellEnd"/>
-      <w:r>
-        <w:rPr>
-          <w:sz w:val="22"/>
-          <w:szCs w:val="22"/>
-        </w:rPr>
-        <w:t xml:space="preserve"> reduziert und wird nur noch als Follow-</w:t>
-      </w:r>
-      <w:proofErr w:type="spellStart"/>
-      <w:r>
-        <w:rPr>
-          <w:sz w:val="22"/>
-          <w:szCs w:val="22"/>
-        </w:rPr>
-        <w:t>up</w:t>
-      </w:r>
-      <w:proofErr w:type="spellEnd"/>
-      <w:r>
-        <w:rPr>
-          <w:sz w:val="22"/>
-          <w:szCs w:val="22"/>
-        </w:rPr>
-        <w:t xml:space="preserve"> für nachgeladene Inhalte verwendet.</w:t>
-      </w:r>
-    </w:p>
-    <w:p>
-      <w:pPr>
-        <w:rPr>
-          <w:sz w:val="22"/>
-          <w:szCs w:val="22"/>
-        </w:rPr>
-      </w:pPr>
+        <w:t>Der Debounce wurde auf 50 ms reduziert und wird nur noch als Follow-up für nachgeladene Inhalte verwendet.</w:t>
+      </w:r>
+    </w:p>
+    <w:p>
+      <w:pPr>
+        <w:rPr>
+          <w:sz w:val="22"/>
+          <w:szCs w:val="22"/>
+        </w:rPr>
+      </w:pPr>
+      <w:r>
+        <w:rPr>
+          <w:sz w:val="22"/>
+          <w:szCs w:val="22"/>
+        </w:rPr>
+        <w:pict w14:anchorId="083157FE">
+          <v:rect id="_x0000_i1039" style="width:0;height:1.5pt" o:hralign="center" o:hrstd="t" o:hr="t" fillcolor="#a0a0a0" stroked="f"/>
+        </w:pict>
+      </w:r>
+    </w:p>
+    <w:p>
+      <w:pPr>
+        <w:rPr>
+          <w:sz w:val="22"/>
+          <w:szCs w:val="22"/>
+        </w:rPr>
+      </w:pPr>
+      <w:r>
+        <w:rPr>
+          <w:rFonts w:ascii="Segoe UI Emoji" w:hAnsi="Segoe UI Emoji" w:cs="Segoe UI Emoji"/>
+          <w:sz w:val="22"/>
+          <w:szCs w:val="22"/>
+        </w:rPr>
+        <w:t>⚠️</w:t>
+      </w:r>
+      <w:r>
+        <w:rPr>
+          <w:sz w:val="22"/>
+          <w:szCs w:val="22"/>
+        </w:rPr>
+        <w:t xml:space="preserve"> Problem:</w:t>
+      </w:r>
+    </w:p>
+    <w:p>
+      <w:pPr>
+        <w:rPr>
+          <w:sz w:val="22"/>
+          <w:szCs w:val="22"/>
+        </w:rPr>
+      </w:pPr>
+      <w:r>
+        <w:rPr>
+          <w:sz w:val="22"/>
+          <w:szCs w:val="22"/>
+        </w:rPr>
+        <w:t>Der Satz „Billed every 4 Wochen“ wurde von StayAI in mehrere Text-Nodes aufgeteilt. Eine normale Regex-Übersetzung konnte den vollständigen Satz deshalb nicht zuverlässig erkennen.</w:t>
+      </w:r>
+    </w:p>
+    <w:p>
+      <w:pPr>
+        <w:rPr>
+          <w:sz w:val="22"/>
+          <w:szCs w:val="22"/>
+        </w:rPr>
+      </w:pPr>
+    </w:p>
+    <w:p>
+      <w:pPr>
+        <w:rPr>
+          <w:sz w:val="22"/>
+          <w:szCs w:val="22"/>
+        </w:rPr>
+      </w:pPr>
+      <w:r>
+        <w:rPr>
+          <w:rFonts w:ascii="Segoe UI Emoji" w:hAnsi="Segoe UI Emoji" w:cs="Segoe UI Emoji"/>
+          <w:sz w:val="22"/>
+          <w:szCs w:val="22"/>
+        </w:rPr>
+        <w:t>✅</w:t>
+      </w:r>
+      <w:r>
+        <w:rPr>
+          <w:sz w:val="22"/>
+          <w:szCs w:val="22"/>
+        </w:rPr>
+        <w:t xml:space="preserve"> Lösung:</w:t>
+      </w:r>
+    </w:p>
+    <w:p>
+      <w:pPr>
+        <w:rPr>
+          <w:sz w:val="22"/>
+          <w:szCs w:val="22"/>
+        </w:rPr>
+      </w:pPr>
+      <w:r>
+        <w:rPr>
+          <w:sz w:val="22"/>
+          <w:szCs w:val="22"/>
+        </w:rPr>
+        <w:t>Eine Spezialbehandlung für Split-Text-Nodes wurde ergänzt. Der Parent-Text wird erkannt, aber nur die statischen Text-Nodes werden angepasst.</w:t>
+      </w:r>
+    </w:p>
+    <w:p>
+      <w:pPr>
+        <w:rPr>
+          <w:sz w:val="22"/>
+          <w:szCs w:val="22"/>
+        </w:rPr>
+      </w:pPr>
+      <w:r>
+        <w:rPr>
+          <w:sz w:val="22"/>
+          <w:szCs w:val="22"/>
+        </w:rPr>
+        <w:pict w14:anchorId="49D2C36A">
+          <v:rect id="_x0000_i1040" style="width:0;height:1.5pt" o:hralign="center" o:hrstd="t" o:hr="t" fillcolor="#a0a0a0" stroked="f"/>
+        </w:pict>
+      </w:r>
+    </w:p>
+    <w:p>
+      <w:pPr>
+        <w:rPr>
+          <w:sz w:val="22"/>
+          <w:szCs w:val="22"/>
+        </w:rPr>
+      </w:pPr>
+      <w:r>
+        <w:rPr>
+          <w:rFonts w:ascii="Segoe UI Emoji" w:hAnsi="Segoe UI Emoji" w:cs="Segoe UI Emoji"/>
+          <w:sz w:val="22"/>
+          <w:szCs w:val="22"/>
+        </w:rPr>
+        <w:t>⚠️</w:t>
+      </w:r>
+      <w:r>
+        <w:rPr>
+          <w:sz w:val="22"/>
+          <w:szCs w:val="22"/>
+        </w:rPr>
+        <w:t xml:space="preserve"> Problem:</w:t>
+      </w:r>
+    </w:p>
+    <w:p>
+      <w:pPr>
+        <w:rPr>
+          <w:sz w:val="22"/>
+          <w:szCs w:val="22"/>
+        </w:rPr>
+      </w:pPr>
+      <w:r>
+        <w:rPr>
+          <w:sz w:val="22"/>
+          <w:szCs w:val="22"/>
+        </w:rPr>
+        <w:t>Die erste Lösung hat den kompletten Satz durch einen einzelnen Text ersetzt. Dadurch wurde der dynamische Zahlen-Node zerstört und beim Wechsel von 4 auf 8 Wochen blieb der alte Wert stehen.</w:t>
+      </w:r>
+    </w:p>
+    <w:p>
+      <w:pPr>
+        <w:rPr>
+          <w:sz w:val="22"/>
+          <w:szCs w:val="22"/>
+        </w:rPr>
+      </w:pPr>
+    </w:p>
+    <w:p>
+      <w:pPr>
+        <w:rPr>
+          <w:sz w:val="22"/>
+          <w:szCs w:val="22"/>
+        </w:rPr>
+      </w:pPr>
+      <w:r>
+        <w:rPr>
+          <w:rFonts w:ascii="Segoe UI Emoji" w:hAnsi="Segoe UI Emoji" w:cs="Segoe UI Emoji"/>
+          <w:sz w:val="22"/>
+          <w:szCs w:val="22"/>
+        </w:rPr>
+        <w:t>✅</w:t>
+      </w:r>
+      <w:r>
+        <w:rPr>
+          <w:sz w:val="22"/>
+          <w:szCs w:val="22"/>
+        </w:rPr>
+        <w:t xml:space="preserve"> Lösung:</w:t>
+      </w:r>
+    </w:p>
+    <w:p>
+      <w:pPr>
+        <w:rPr>
+          <w:sz w:val="22"/>
+          <w:szCs w:val="22"/>
+        </w:rPr>
+      </w:pPr>
+      <w:r>
+        <w:rPr>
+          <w:sz w:val="22"/>
+          <w:szCs w:val="22"/>
+        </w:rPr>
+        <w:t>Die ursprüngliche Node-Struktur bleibt erhalten. Nur „Billed every“ wird zu „Alle“ und der Wochen-Text zu „Wochen abgerechnet“. Der Zahlen-Node bleibt React-kontrolliert und kann weiterhin aktualisiert werden.</w:t>
+      </w:r>
+    </w:p>
+    <w:p>
+      <w:pPr>
+        <w:rPr>
+          <w:sz w:val="22"/>
+          <w:szCs w:val="22"/>
+        </w:rPr>
+      </w:pPr>
+      <w:r>
+        <w:rPr>
+          <w:sz w:val="22"/>
+          <w:szCs w:val="22"/>
+        </w:rPr>
+        <w:lastRenderedPageBreak/>
+        <w:pict w14:anchorId="5932F4CE">
+          <v:rect id="_x0000_i1041" style="width:0;height:1.5pt" o:hralign="center" o:hrstd="t" o:hr="t" fillcolor="#a0a0a0" stroked="f"/>
+        </w:pict>
+      </w:r>
     </w:p>
     <w:sectPr>
       <w:pgSz w:w="11906" w:h="16838"/>
@@ -2546,6 +2178,7 @@
   <w:style w:type="character" w:default="1" w:styleId="DefaultParagraphFont">
     <w:name w:val="Default Paragraph Font"/>
     <w:uiPriority w:val="1"/>
+    <w:semiHidden/>
     <w:unhideWhenUsed/>
   </w:style>
   <w:style w:type="table" w:default="1" w:styleId="TableNormal">

</xml_diff>